<commit_message>
Pushing hello world program, updating TechnologySetupChecklist_Assignment.docx
</commit_message>
<xml_diff>
--- a/Assignments/TechnologySetupChecklist_Assignment.docx
+++ b/Assignments/TechnologySetupChecklist_Assignment.docx
@@ -207,14 +207,7 @@
           <w:i/>
           <w:iCs/>
         </w:rPr>
-        <w:t>08_25_2025</w:t>
-      </w:r>
-      <w:r>
-        <w:rPr>
-          <w:i/>
-          <w:iCs/>
-        </w:rPr>
-        <w:t>/hello</w:t>
+        <w:t>01_16_2026/</w:t>
       </w:r>
       <w:r>
         <w:t xml:space="preserve"> folder in the GitHub repository (from 2 above) and include a screenshot of the output of that program in your submission).</w:t>

</xml_diff>